<commit_message>
update to dances and schedule
Updated Brotherhood of Man, Secretary is Not a Toy
Removed the Special Announcement
Updated the schedule
</commit_message>
<xml_diff>
--- a/howTo26/dance/Brotherhood.docx
+++ b/howTo26/dance/Brotherhood.docx
@@ -2159,7 +2159,7 @@
           <w:numId w:val="16"/>
         </w:numPr>
         <w:shd w:val="clear" w:color="auto" w:fill="FFFFFF"/>
-        <w:spacing w:before="100" w:beforeAutospacing="1" w:after="100" w:afterAutospacing="1" w:line="240" w:lineRule="auto"/>
+        <w:spacing w:before="100" w:beforeAutospacing="1" w:after="0" w:line="240" w:lineRule="auto"/>
         <w:rPr>
           <w:rFonts w:ascii="Calibri" w:hAnsi="Calibri" w:cs="Calibri"/>
           <w:color w:val="333333"/>
@@ -2378,7 +2378,7 @@
           <w:numId w:val="17"/>
         </w:numPr>
         <w:shd w:val="clear" w:color="auto" w:fill="FFFFFF"/>
-        <w:spacing w:before="100" w:beforeAutospacing="1" w:after="100" w:afterAutospacing="1" w:line="240" w:lineRule="auto"/>
+        <w:spacing w:before="100" w:beforeAutospacing="1" w:after="0" w:line="240" w:lineRule="auto"/>
         <w:rPr>
           <w:rFonts w:ascii="Calibri" w:hAnsi="Calibri" w:cs="Calibri"/>
           <w:color w:val="333333"/>
@@ -3213,6 +3213,7 @@
     <w:p>
       <w:pPr>
         <w:shd w:val="clear" w:color="auto" w:fill="FFFFFF"/>
+        <w:spacing w:before="240" w:after="0"/>
         <w:rPr>
           <w:rFonts w:ascii="Calibri" w:hAnsi="Calibri" w:cs="Calibri"/>
           <w:color w:val="333333"/>
@@ -3249,7 +3250,7 @@
           <w:numId w:val="19"/>
         </w:numPr>
         <w:shd w:val="clear" w:color="auto" w:fill="FFFFFF"/>
-        <w:spacing w:after="100" w:afterAutospacing="1" w:line="240" w:lineRule="auto"/>
+        <w:spacing w:after="0" w:line="240" w:lineRule="auto"/>
         <w:rPr>
           <w:rFonts w:ascii="Calibri" w:hAnsi="Calibri" w:cs="Calibri"/>
           <w:color w:val="333333"/>
@@ -3281,7 +3282,7 @@
           <w:rFonts w:ascii="Calibri" w:hAnsi="Calibri" w:cs="Calibri"/>
           <w:color w:val="333333"/>
         </w:rPr>
-        <w:t>Elbows out and right knee up on “is free”</w:t>
+        <w:t>Elbows out on “is free”</w:t>
       </w:r>
     </w:p>
     <w:p>
@@ -3302,7 +3303,35 @@
           <w:rFonts w:ascii="Calibri" w:hAnsi="Calibri" w:cs="Calibri"/>
           <w:color w:val="333333"/>
         </w:rPr>
-        <w:t>Bend to the left on “Keep”</w:t>
+        <w:t xml:space="preserve">Bend to </w:t>
+      </w:r>
+      <w:r>
+        <w:rPr>
+          <w:rFonts w:ascii="Calibri" w:hAnsi="Calibri" w:cs="Calibri"/>
+          <w:color w:val="333333"/>
+        </w:rPr>
+        <w:t>with</w:t>
+      </w:r>
+      <w:r>
+        <w:rPr>
+          <w:rFonts w:ascii="Calibri" w:hAnsi="Calibri" w:cs="Calibri"/>
+          <w:color w:val="333333"/>
+        </w:rPr>
+        <w:t xml:space="preserve"> left</w:t>
+      </w:r>
+      <w:r>
+        <w:rPr>
+          <w:rFonts w:ascii="Calibri" w:hAnsi="Calibri" w:cs="Calibri"/>
+          <w:color w:val="333333"/>
+        </w:rPr>
+        <w:t xml:space="preserve"> elbow</w:t>
+      </w:r>
+      <w:r>
+        <w:rPr>
+          <w:rFonts w:ascii="Calibri" w:hAnsi="Calibri" w:cs="Calibri"/>
+          <w:color w:val="333333"/>
+        </w:rPr>
+        <w:t xml:space="preserve"> on “Keep”</w:t>
       </w:r>
     </w:p>
     <w:p>
@@ -3323,7 +3352,35 @@
           <w:rFonts w:ascii="Calibri" w:hAnsi="Calibri" w:cs="Calibri"/>
           <w:color w:val="333333"/>
         </w:rPr>
-        <w:t>Bend to the right on “</w:t>
+        <w:t xml:space="preserve">Bend to </w:t>
+      </w:r>
+      <w:r>
+        <w:rPr>
+          <w:rFonts w:ascii="Calibri" w:hAnsi="Calibri" w:cs="Calibri"/>
+          <w:color w:val="333333"/>
+        </w:rPr>
+        <w:t>with</w:t>
+      </w:r>
+      <w:r>
+        <w:rPr>
+          <w:rFonts w:ascii="Calibri" w:hAnsi="Calibri" w:cs="Calibri"/>
+          <w:color w:val="333333"/>
+        </w:rPr>
+        <w:t xml:space="preserve"> right</w:t>
+      </w:r>
+      <w:r>
+        <w:rPr>
+          <w:rFonts w:ascii="Calibri" w:hAnsi="Calibri" w:cs="Calibri"/>
+          <w:color w:val="333333"/>
+        </w:rPr>
+        <w:t xml:space="preserve"> elbow</w:t>
+      </w:r>
+      <w:r>
+        <w:rPr>
+          <w:rFonts w:ascii="Calibri" w:hAnsi="Calibri" w:cs="Calibri"/>
+          <w:color w:val="333333"/>
+        </w:rPr>
+        <w:t xml:space="preserve"> on “</w:t>
       </w:r>
       <w:proofErr w:type="spellStart"/>
       <w:r>
@@ -3551,7 +3608,49 @@
           <w:rFonts w:ascii="Calibri" w:hAnsi="Calibri" w:cs="Calibri"/>
           <w:color w:val="333333"/>
         </w:rPr>
-        <w:t>Both hands up to the right on “broth” → left on “er” → right on “hood” → left on “of”</w:t>
+        <w:t xml:space="preserve">Both hands up to the right on “broth” → </w:t>
+      </w:r>
+      <w:r>
+        <w:rPr>
+          <w:rFonts w:ascii="Calibri" w:hAnsi="Calibri" w:cs="Calibri"/>
+          <w:color w:val="333333"/>
+        </w:rPr>
+        <w:t>pump</w:t>
+      </w:r>
+      <w:r>
+        <w:rPr>
+          <w:rFonts w:ascii="Calibri" w:hAnsi="Calibri" w:cs="Calibri"/>
+          <w:color w:val="333333"/>
+        </w:rPr>
+        <w:t xml:space="preserve"> on “er” → </w:t>
+      </w:r>
+      <w:r>
+        <w:rPr>
+          <w:rFonts w:ascii="Calibri" w:hAnsi="Calibri" w:cs="Calibri"/>
+          <w:color w:val="333333"/>
+        </w:rPr>
+        <w:t>to the left</w:t>
+      </w:r>
+      <w:r>
+        <w:rPr>
+          <w:rFonts w:ascii="Calibri" w:hAnsi="Calibri" w:cs="Calibri"/>
+          <w:color w:val="333333"/>
+        </w:rPr>
+        <w:t xml:space="preserve"> on “hood” → </w:t>
+      </w:r>
+      <w:r>
+        <w:rPr>
+          <w:rFonts w:ascii="Calibri" w:hAnsi="Calibri" w:cs="Calibri"/>
+          <w:color w:val="333333"/>
+        </w:rPr>
+        <w:t>pump</w:t>
+      </w:r>
+      <w:r>
+        <w:rPr>
+          <w:rFonts w:ascii="Calibri" w:hAnsi="Calibri" w:cs="Calibri"/>
+          <w:color w:val="333333"/>
+        </w:rPr>
+        <w:t xml:space="preserve"> on “of”</w:t>
       </w:r>
     </w:p>
     <w:p>
@@ -3631,6 +3730,27 @@
           <w:color w:val="333333"/>
         </w:rPr>
         <w:t xml:space="preserve"> left hand up to the left/right hand down to the right</w:t>
+      </w:r>
+    </w:p>
+    <w:p>
+      <w:pPr>
+        <w:numPr>
+          <w:ilvl w:val="1"/>
+          <w:numId w:val="20"/>
+        </w:numPr>
+        <w:shd w:val="clear" w:color="auto" w:fill="FFFFFF"/>
+        <w:spacing w:before="100" w:beforeAutospacing="1" w:after="100" w:afterAutospacing="1" w:line="240" w:lineRule="auto"/>
+        <w:rPr>
+          <w:rFonts w:ascii="Calibri" w:hAnsi="Calibri" w:cs="Calibri"/>
+          <w:color w:val="333333"/>
+        </w:rPr>
+      </w:pPr>
+      <w:r>
+        <w:rPr>
+          <w:rFonts w:ascii="Calibri" w:hAnsi="Calibri" w:cs="Calibri"/>
+          <w:color w:val="333333"/>
+        </w:rPr>
+        <w:t>Jeff, Chris, Bill left Andrea</w:t>
       </w:r>
     </w:p>
     <w:sectPr>

</xml_diff>